<commit_message>
Regenerate test evidence from the final code
</commit_message>
<xml_diff>
--- a/tests/evidence/INF2005_ACW1_P6-4_Test_Evidence.docx
+++ b/tests/evidence/INF2005_ACW1_P6-4_Test_Evidence.docx
@@ -253,7 +253,7 @@
                 <w:sz w:val="18"/>
                 <w:szCs w:val="18"/>
               </w:rPr>
-              <w:t xml:space="preserve">2026-09-28 16:16 by tools/generate_evidence.py</w:t>
+              <w:t xml:space="preserve">2026-09-28 19:43 by tools/generate_evidence.py</w:t>
             </w:r>
           </w:p>
         </w:tc>
@@ -315,7 +315,7 @@
                 <w:sz w:val="18"/>
                 <w:szCs w:val="18"/>
               </w:rPr>
-              <w:t xml:space="preserve">branch m6-advanced, commit f883eb2</w:t>
+              <w:t xml:space="preserve">branch wrap-up, commit 464a27f</w:t>
             </w:r>
           </w:p>
         </w:tc>
@@ -563,7 +563,7 @@
                 <w:sz w:val="18"/>
                 <w:szCs w:val="18"/>
               </w:rPr>
-              <w:t xml:space="preserve">83 passed in 20.33s</w:t>
+              <w:t xml:space="preserve">89 passed in 24.75s</w:t>
             </w:r>
           </w:p>
         </w:tc>
@@ -602,7 +602,7 @@
           <w:sz w:val="21"/>
           <w:szCs w:val="21"/>
         </w:rPr>
-        <w:t xml:space="preserve">4 positive and 7 negative cases across image and audio, all with the expected outcome. The Attack Lab caught 11/11 attacks on the image and 11/11 on the audio. The optional challenges (video, robust embedding, steganalysis) add 6 more cases. 83 passed automated tests.</w:t>
+        <w:t xml:space="preserve">4 positive and 7 negative cases across image and audio, all with the expected outcome. The Attack Lab caught 11/11 attacks on the image and 11/11 on the audio. The optional challenges (video, robust embedding, steganalysis) add 6 more cases. 89 passed automated tests.</w:t>
       </w:r>
     </w:p>
     <w:p>
@@ -6611,7 +6611,7 @@
           <w:sz w:val="15"/>
           <w:szCs w:val="15"/>
         </w:rPr>
-        <w:t xml:space="preserve">    "ct": "00e08b6b66381148511b09fe…"</w:t>
+        <w:t xml:space="preserve">    "ct": "089da21c3b82fa51fec0679c…"</w:t>
       </w:r>
     </w:p>
     <w:p>
@@ -6781,7 +6781,7 @@
           <w:sz w:val="15"/>
           <w:szCs w:val="15"/>
         </w:rPr>
-        <w:t xml:space="preserve">      "ct": "00e08b6b66381148511b09fe…",</w:t>
+        <w:t xml:space="preserve">      "ct": "089da21c3b82fa51fec0679c…",</w:t>
       </w:r>
     </w:p>
     <w:p>
@@ -7140,7 +7140,7 @@
           <w:sz w:val="15"/>
           <w:szCs w:val="15"/>
         </w:rPr>
-        <w:t xml:space="preserve">    "ct": "58dd791da27cad89dc2df4a9…"</w:t>
+        <w:t xml:space="preserve">    "ct": "f818542c556126ba6cfd8393…"</w:t>
       </w:r>
     </w:p>
     <w:p>
@@ -7310,7 +7310,7 @@
           <w:sz w:val="15"/>
           <w:szCs w:val="15"/>
         </w:rPr>
-        <w:t xml:space="preserve">      "ct": "58dd791da27cad89dc2df4a9…",</w:t>
+        <w:t xml:space="preserve">      "ct": "f818542c556126ba6cfd8393…",</w:t>
       </w:r>
     </w:p>
     <w:p>
@@ -7889,7 +7889,7 @@
                 <w:sz w:val="18"/>
                 <w:szCs w:val="18"/>
               </w:rPr>
-              <w:t xml:space="preserve">4,422</w:t>
+              <w:t xml:space="preserve">4,436</w:t>
             </w:r>
           </w:p>
         </w:tc>
@@ -8104,7 +8104,7 @@
                 <w:sz w:val="18"/>
                 <w:szCs w:val="18"/>
               </w:rPr>
-              <w:t xml:space="preserve">3,316</w:t>
+              <w:t xml:space="preserve">3,322</w:t>
             </w:r>
           </w:p>
         </w:tc>
@@ -8319,7 +8319,7 @@
                 <w:sz w:val="18"/>
                 <w:szCs w:val="18"/>
               </w:rPr>
-              <w:t xml:space="preserve">2,578</w:t>
+              <w:t xml:space="preserve">2,570</w:t>
             </w:r>
           </w:p>
         </w:tc>
@@ -8534,7 +8534,7 @@
                 <w:sz w:val="18"/>
                 <w:szCs w:val="18"/>
               </w:rPr>
-              <w:t xml:space="preserve">2,066</w:t>
+              <w:t xml:space="preserve">2,073</w:t>
             </w:r>
           </w:p>
         </w:tc>
@@ -8749,7 +8749,7 @@
                 <w:sz w:val="18"/>
                 <w:szCs w:val="18"/>
               </w:rPr>
-              <w:t xml:space="preserve">1,716</w:t>
+              <w:t xml:space="preserve">1,720</w:t>
             </w:r>
           </w:p>
         </w:tc>
@@ -8779,7 +8779,7 @@
                 <w:sz w:val="18"/>
                 <w:szCs w:val="18"/>
               </w:rPr>
-              <w:t xml:space="preserve">52.2 dB</w:t>
+              <w:t xml:space="preserve">52.3 dB</w:t>
             </w:r>
           </w:p>
         </w:tc>
@@ -8994,7 +8994,7 @@
                 <w:sz w:val="18"/>
                 <w:szCs w:val="18"/>
               </w:rPr>
-              <w:t xml:space="preserve">46.0 dB</w:t>
+              <w:t xml:space="preserve">45.9 dB</w:t>
             </w:r>
           </w:p>
         </w:tc>
@@ -9424,7 +9424,7 @@
                 <w:sz w:val="18"/>
                 <w:szCs w:val="18"/>
               </w:rPr>
-              <w:t xml:space="preserve">32.8 dB</w:t>
+              <w:t xml:space="preserve">32.9 dB</w:t>
             </w:r>
           </w:p>
         </w:tc>
@@ -9885,7 +9885,7 @@
                 <w:sz w:val="18"/>
                 <w:szCs w:val="18"/>
               </w:rPr>
-              <w:t xml:space="preserve">4,480</w:t>
+              <w:t xml:space="preserve">4,441</w:t>
             </w:r>
           </w:p>
         </w:tc>
@@ -9915,7 +9915,7 @@
                 <w:sz w:val="18"/>
                 <w:szCs w:val="18"/>
               </w:rPr>
-              <w:t xml:space="preserve">96.0 dB</w:t>
+              <w:t xml:space="preserve">96.1 dB</w:t>
             </w:r>
           </w:p>
         </w:tc>
@@ -10100,7 +10100,7 @@
                 <w:sz w:val="18"/>
                 <w:szCs w:val="18"/>
               </w:rPr>
-              <w:t xml:space="preserve">3,277</w:t>
+              <w:t xml:space="preserve">3,308</w:t>
             </w:r>
           </w:p>
         </w:tc>
@@ -10315,7 +10315,7 @@
                 <w:sz w:val="18"/>
                 <w:szCs w:val="18"/>
               </w:rPr>
-              <w:t xml:space="preserve">2,582</w:t>
+              <w:t xml:space="preserve">2,589</w:t>
             </w:r>
           </w:p>
         </w:tc>
@@ -10960,7 +10960,7 @@
                 <w:sz w:val="18"/>
                 <w:szCs w:val="18"/>
               </w:rPr>
-              <w:t xml:space="preserve">1,463</w:t>
+              <w:t xml:space="preserve">1,462</w:t>
             </w:r>
           </w:p>
         </w:tc>
@@ -11420,7 +11420,7 @@
                 <w:sz w:val="18"/>
                 <w:szCs w:val="18"/>
               </w:rPr>
-              <w:t xml:space="preserve">61.5 dB</w:t>
+              <w:t xml:space="preserve">61.6 dB</w:t>
             </w:r>
           </w:p>
         </w:tc>
@@ -24303,7 +24303,7 @@
                 <w:sz w:val="18"/>
                 <w:szCs w:val="18"/>
               </w:rPr>
-              <w:t xml:space="preserve">493,282–495,054</w:t>
+              <w:t xml:space="preserve">493,282–495,066</w:t>
             </w:r>
           </w:p>
         </w:tc>
@@ -24888,7 +24888,7 @@
                 <w:sz w:val="18"/>
                 <w:szCs w:val="18"/>
               </w:rPr>
-              <w:t xml:space="preserve">63%</w:t>
+              <w:t xml:space="preserve">62%</w:t>
             </w:r>
           </w:p>
         </w:tc>
@@ -26896,7 +26896,7 @@
                 <w:sz w:val="15"/>
                 <w:szCs w:val="15"/>
               </w:rPr>
-              <w:t xml:space="preserve">5ebcd4f24cec2d62650b74021bcceb884cf4fa90dccfc6ed16c3d39491251df1</w:t>
+              <w:t xml:space="preserve">d0cd9de392c1562f67280d34905612cdda69ef34978da94b77740b75ed20849a</w:t>
             </w:r>
           </w:p>
         </w:tc>
@@ -27020,7 +27020,7 @@
                 <w:sz w:val="15"/>
                 <w:szCs w:val="15"/>
               </w:rPr>
-              <w:t xml:space="preserve">5128fbe1721762442b6428c7ddb7fd46adb805cb179ccf51a63f1eb09deb697b</w:t>
+              <w:t xml:space="preserve">fe187646874d838b31a4807c437be4688efc7dd0d902fcbaa09a6515e639106d</w:t>
             </w:r>
           </w:p>
         </w:tc>
@@ -27284,7 +27284,7 @@
           <w:sz w:val="21"/>
           <w:szCs w:val="21"/>
         </w:rPr>
-        <w:t xml:space="preserve">python -m pytest -v: 83 passed in 20.33s. The full output is in tests/evidence/logs/pytest.txt.</w:t>
+        <w:t xml:space="preserve">python -m pytest -v: 89 passed in 24.75s. The full output is in tests/evidence/logs/pytest.txt.</w:t>
       </w:r>
     </w:p>
     <w:p>
@@ -27607,7 +27607,7 @@
           <w:sz w:val="15"/>
           <w:szCs w:val="15"/>
         </w:rPr>
-        <w:t xml:space="preserve">test_advanced.py::test_video_lossy_output_refused PASSED</w:t>
+        <w:t xml:space="preserve">test_advanced.py::test_big_video_fails_fast_with_numbers PASSED</w:t>
       </w:r>
     </w:p>
     <w:p>
@@ -27624,7 +27624,7 @@
           <w:sz w:val="15"/>
           <w:szCs w:val="15"/>
         </w:rPr>
-        <w:t xml:space="preserve">test_attacks.py::test_every_attack_is_caught[png-1] PASSED</w:t>
+        <w:t xml:space="preserve">test_advanced.py::test_shrink_video_makes_a_small_lossless_cover PASSED</w:t>
       </w:r>
     </w:p>
     <w:p>
@@ -27641,7 +27641,7 @@
           <w:sz w:val="15"/>
           <w:szCs w:val="15"/>
         </w:rPr>
-        <w:t xml:space="preserve">test_attacks.py::test_every_attack_is_caught[png-2] PASSED</w:t>
+        <w:t xml:space="preserve">test_advanced.py::test_video_lossy_output_refused PASSED</w:t>
       </w:r>
     </w:p>
     <w:p>
@@ -27658,7 +27658,7 @@
           <w:sz w:val="15"/>
           <w:szCs w:val="15"/>
         </w:rPr>
-        <w:t xml:space="preserve">test_attacks.py::test_every_attack_is_caught[png-8] PASSED</w:t>
+        <w:t xml:space="preserve">test_attacks.py::test_every_attack_is_caught[png-1] PASSED</w:t>
       </w:r>
     </w:p>
     <w:p>
@@ -27675,7 +27675,7 @@
           <w:sz w:val="15"/>
           <w:szCs w:val="15"/>
         </w:rPr>
-        <w:t xml:space="preserve">test_attacks.py::test_every_attack_is_caught[wav-1] PASSED</w:t>
+        <w:t xml:space="preserve">test_attacks.py::test_every_attack_is_caught[png-2] PASSED</w:t>
       </w:r>
     </w:p>
     <w:p>
@@ -27692,7 +27692,7 @@
           <w:sz w:val="15"/>
           <w:szCs w:val="15"/>
         </w:rPr>
-        <w:t xml:space="preserve">test_attacks.py::test_every_attack_is_caught[wav-2] PASSED</w:t>
+        <w:t xml:space="preserve">test_attacks.py::test_every_attack_is_caught[png-8] PASSED</w:t>
       </w:r>
     </w:p>
     <w:p>
@@ -27709,7 +27709,7 @@
           <w:sz w:val="15"/>
           <w:szCs w:val="15"/>
         </w:rPr>
-        <w:t xml:space="preserve">test_attacks.py::test_every_attack_is_caught[wav-8] PASSED</w:t>
+        <w:t xml:space="preserve">test_attacks.py::test_every_attack_is_caught[wav-1] PASSED</w:t>
       </w:r>
     </w:p>
     <w:p>
@@ -27726,7 +27726,7 @@
           <w:sz w:val="15"/>
           <w:szCs w:val="15"/>
         </w:rPr>
-        <w:t xml:space="preserve">test_attacks.py::test_real_replay_store_untouched PASSED</w:t>
+        <w:t xml:space="preserve">test_attacks.py::test_every_attack_is_caught[wav-2] PASSED</w:t>
       </w:r>
     </w:p>
     <w:p>
@@ -27743,7 +27743,7 @@
           <w:sz w:val="15"/>
           <w:szCs w:val="15"/>
         </w:rPr>
-        <w:t xml:space="preserve">test_attacks.py::test_needs_an_authentic_file PASSED</w:t>
+        <w:t xml:space="preserve">test_attacks.py::test_every_attack_is_caught[wav-8] PASSED</w:t>
       </w:r>
     </w:p>
     <w:p>
@@ -27760,7 +27760,7 @@
           <w:sz w:val="15"/>
           <w:szCs w:val="15"/>
         </w:rPr>
-        <w:t xml:space="preserve">test_core.py::test_lsb_roundtrip_wraps_around PASSED</w:t>
+        <w:t xml:space="preserve">test_attacks.py::test_real_replay_store_untouched PASSED</w:t>
       </w:r>
     </w:p>
     <w:p>
@@ -27777,7 +27777,7 @@
           <w:sz w:val="15"/>
           <w:szCs w:val="15"/>
         </w:rPr>
-        <w:t xml:space="preserve">test_core.py::test_image_authentic_all_k[1] PASSED</w:t>
+        <w:t xml:space="preserve">test_attacks.py::test_needs_an_authentic_file PASSED</w:t>
       </w:r>
     </w:p>
     <w:p>
@@ -27794,7 +27794,7 @@
           <w:sz w:val="15"/>
           <w:szCs w:val="15"/>
         </w:rPr>
-        <w:t xml:space="preserve">test_core.py::test_image_authentic_all_k[2] PASSED</w:t>
+        <w:t xml:space="preserve">test_core.py::test_lsb_roundtrip_wraps_around PASSED</w:t>
       </w:r>
     </w:p>
     <w:p>
@@ -27811,7 +27811,7 @@
           <w:sz w:val="15"/>
           <w:szCs w:val="15"/>
         </w:rPr>
-        <w:t xml:space="preserve">test_core.py::test_image_authentic_all_k[3] PASSED</w:t>
+        <w:t xml:space="preserve">test_core.py::test_image_authentic_all_k[1] PASSED</w:t>
       </w:r>
     </w:p>
     <w:p>
@@ -27828,7 +27828,7 @@
           <w:sz w:val="15"/>
           <w:szCs w:val="15"/>
         </w:rPr>
-        <w:t xml:space="preserve">test_core.py::test_image_authentic_all_k[4] PASSED</w:t>
+        <w:t xml:space="preserve">test_core.py::test_image_authentic_all_k[2] PASSED</w:t>
       </w:r>
     </w:p>
     <w:p>
@@ -27845,7 +27845,7 @@
           <w:sz w:val="15"/>
           <w:szCs w:val="15"/>
         </w:rPr>
-        <w:t xml:space="preserve">test_core.py::test_image_authentic_all_k[5] PASSED</w:t>
+        <w:t xml:space="preserve">test_core.py::test_image_authentic_all_k[3] PASSED</w:t>
       </w:r>
     </w:p>
     <w:p>
@@ -27862,7 +27862,7 @@
           <w:sz w:val="15"/>
           <w:szCs w:val="15"/>
         </w:rPr>
-        <w:t xml:space="preserve">test_core.py::test_image_authentic_all_k[6] PASSED</w:t>
+        <w:t xml:space="preserve">test_core.py::test_image_authentic_all_k[4] PASSED</w:t>
       </w:r>
     </w:p>
     <w:p>
@@ -27879,7 +27879,7 @@
           <w:sz w:val="15"/>
           <w:szCs w:val="15"/>
         </w:rPr>
-        <w:t xml:space="preserve">test_core.py::test_image_authentic_all_k[7] PASSED</w:t>
+        <w:t xml:space="preserve">test_core.py::test_image_authentic_all_k[5] PASSED</w:t>
       </w:r>
     </w:p>
     <w:p>
@@ -27896,7 +27896,7 @@
           <w:sz w:val="15"/>
           <w:szCs w:val="15"/>
         </w:rPr>
-        <w:t xml:space="preserve">test_core.py::test_image_authentic_all_k[8] PASSED</w:t>
+        <w:t xml:space="preserve">test_core.py::test_image_authentic_all_k[6] PASSED</w:t>
       </w:r>
     </w:p>
     <w:p>
@@ -27913,7 +27913,7 @@
           <w:sz w:val="15"/>
           <w:szCs w:val="15"/>
         </w:rPr>
-        <w:t xml:space="preserve">test_core.py::test_audio_authentic[1] PASSED</w:t>
+        <w:t xml:space="preserve">test_core.py::test_image_authentic_all_k[7] PASSED</w:t>
       </w:r>
     </w:p>
     <w:p>
@@ -27930,7 +27930,7 @@
           <w:sz w:val="15"/>
           <w:szCs w:val="15"/>
         </w:rPr>
-        <w:t xml:space="preserve">test_core.py::test_audio_authentic[4] PASSED</w:t>
+        <w:t xml:space="preserve">test_core.py::test_image_authentic_all_k[8] PASSED</w:t>
       </w:r>
     </w:p>
     <w:p>
@@ -27947,7 +27947,7 @@
           <w:sz w:val="15"/>
           <w:szCs w:val="15"/>
         </w:rPr>
-        <w:t xml:space="preserve">test_core.py::test_audio_authentic[8] PASSED</w:t>
+        <w:t xml:space="preserve">test_core.py::test_audio_authentic[1] PASSED</w:t>
       </w:r>
     </w:p>
     <w:p>
@@ -27964,7 +27964,7 @@
           <w:sz w:val="15"/>
           <w:szCs w:val="15"/>
         </w:rPr>
-        <w:t xml:space="preserve">test_core.py::test_audio_high_byte_untouched PASSED</w:t>
+        <w:t xml:space="preserve">test_core.py::test_audio_authentic[4] PASSED</w:t>
       </w:r>
     </w:p>
     <w:p>
@@ -27981,7 +27981,7 @@
           <w:sz w:val="15"/>
           <w:szCs w:val="15"/>
         </w:rPr>
-        <w:t xml:space="preserve">test_core.py::test_audio_formats_roundtrip_and_preserve_non_carrier_bytes[pcm_wav0] PASSED</w:t>
+        <w:t xml:space="preserve">test_core.py::test_audio_authentic[8] PASSED</w:t>
       </w:r>
     </w:p>
     <w:p>
@@ -27998,7 +27998,7 @@
           <w:sz w:val="15"/>
           <w:szCs w:val="15"/>
         </w:rPr>
-        <w:t xml:space="preserve">test_core.py::test_audio_formats_roundtrip_and_preserve_non_carrier_bytes[pcm_wav1] PASSED</w:t>
+        <w:t xml:space="preserve">test_core.py::test_audio_high_byte_untouched PASSED</w:t>
       </w:r>
     </w:p>
     <w:p>
@@ -28015,7 +28015,7 @@
           <w:sz w:val="15"/>
           <w:szCs w:val="15"/>
         </w:rPr>
-        <w:t xml:space="preserve">test_core.py::test_audio_formats_roundtrip_and_preserve_non_carrier_bytes[pcm_wav2] PASSED</w:t>
+        <w:t xml:space="preserve">test_core.py::test_audio_formats_roundtrip_and_preserve_non_carrier_bytes[pcm_wav0] PASSED</w:t>
       </w:r>
     </w:p>
     <w:p>
@@ -28032,7 +28032,7 @@
           <w:sz w:val="15"/>
           <w:szCs w:val="15"/>
         </w:rPr>
-        <w:t xml:space="preserve">test_core.py::test_audio_formats_roundtrip_and_preserve_non_carrier_bytes[pcm_wav3] PASSED</w:t>
+        <w:t xml:space="preserve">test_core.py::test_audio_formats_roundtrip_and_preserve_non_carrier_bytes[pcm_wav1] PASSED</w:t>
       </w:r>
     </w:p>
     <w:p>
@@ -28049,7 +28049,7 @@
           <w:sz w:val="15"/>
           <w:szCs w:val="15"/>
         </w:rPr>
-        <w:t xml:space="preserve">test_core.py::test_audio_formats_roundtrip_and_preserve_non_carrier_bytes[pcm_wav4] PASSED</w:t>
+        <w:t xml:space="preserve">test_core.py::test_audio_formats_roundtrip_and_preserve_non_carrier_bytes[pcm_wav2] PASSED</w:t>
       </w:r>
     </w:p>
     <w:p>
@@ -28066,7 +28066,7 @@
           <w:sz w:val="15"/>
           <w:szCs w:val="15"/>
         </w:rPr>
-        <w:t xml:space="preserve">test_core.py::test_audio_formats_roundtrip_and_preserve_non_carrier_bytes[pcm_wav5] PASSED</w:t>
+        <w:t xml:space="preserve">test_core.py::test_audio_formats_roundtrip_and_preserve_non_carrier_bytes[pcm_wav3] PASSED</w:t>
       </w:r>
     </w:p>
     <w:p>
@@ -28083,7 +28083,7 @@
           <w:sz w:val="15"/>
           <w:szCs w:val="15"/>
         </w:rPr>
-        <w:t xml:space="preserve">test_core.py::test_audio_waveform_is_normalised_for_pcm_widths[1] PASSED</w:t>
+        <w:t xml:space="preserve">test_core.py::test_audio_formats_roundtrip_and_preserve_non_carrier_bytes[pcm_wav4] PASSED</w:t>
       </w:r>
     </w:p>
     <w:p>
@@ -28100,7 +28100,7 @@
           <w:sz w:val="15"/>
           <w:szCs w:val="15"/>
         </w:rPr>
-        <w:t xml:space="preserve">test_core.py::test_audio_waveform_is_normalised_for_pcm_widths[2] PASSED</w:t>
+        <w:t xml:space="preserve">test_core.py::test_audio_formats_roundtrip_and_preserve_non_carrier_bytes[pcm_wav5] PASSED</w:t>
       </w:r>
     </w:p>
     <w:p>
@@ -28117,7 +28117,7 @@
           <w:sz w:val="15"/>
           <w:szCs w:val="15"/>
         </w:rPr>
-        <w:t xml:space="preserve">test_core.py::test_audio_waveform_is_normalised_for_pcm_widths[3] PASSED</w:t>
+        <w:t xml:space="preserve">test_core.py::test_audio_waveform_is_normalised_for_pcm_widths[1] PASSED</w:t>
       </w:r>
     </w:p>
     <w:p>
@@ -28134,7 +28134,7 @@
           <w:sz w:val="15"/>
           <w:szCs w:val="15"/>
         </w:rPr>
-        <w:t xml:space="preserve">test_core.py::test_stereo_ten_second_capacity_at_two_lsbs PASSED</w:t>
+        <w:t xml:space="preserve">test_core.py::test_audio_waveform_is_normalised_for_pcm_widths[2] PASSED</w:t>
       </w:r>
     </w:p>
     <w:p>
@@ -28151,7 +28151,7 @@
           <w:sz w:val="15"/>
           <w:szCs w:val="15"/>
         </w:rPr>
-        <w:t xml:space="preserve">test_core.py::test_encrypted_message PASSED</w:t>
+        <w:t xml:space="preserve">test_core.py::test_audio_waveform_is_normalised_for_pcm_widths[3] PASSED</w:t>
       </w:r>
     </w:p>
     <w:p>
@@ -28168,7 +28168,7 @@
           <w:sz w:val="15"/>
           <w:szCs w:val="15"/>
         </w:rPr>
-        <w:t xml:space="preserve">test_core.py::test_wrong_key_gives_wrong_start PASSED</w:t>
+        <w:t xml:space="preserve">test_core.py::test_stereo_ten_second_capacity_at_two_lsbs PASSED</w:t>
       </w:r>
     </w:p>
     <w:p>
@@ -28185,7 +28185,7 @@
           <w:sz w:val="15"/>
           <w:szCs w:val="15"/>
         </w:rPr>
-        <w:t xml:space="preserve">test_core.py::test_wrong_start_offset PASSED</w:t>
+        <w:t xml:space="preserve">test_core.py::test_encrypted_message PASSED</w:t>
       </w:r>
     </w:p>
     <w:p>
@@ -28202,7 +28202,7 @@
           <w:sz w:val="15"/>
           <w:szCs w:val="15"/>
         </w:rPr>
-        <w:t xml:space="preserve">test_core.py::test_wrong_public_key PASSED</w:t>
+        <w:t xml:space="preserve">test_core.py::test_wrong_key_gives_wrong_start PASSED</w:t>
       </w:r>
     </w:p>
     <w:p>
@@ -28219,7 +28219,7 @@
           <w:sz w:val="15"/>
           <w:szCs w:val="15"/>
         </w:rPr>
-        <w:t xml:space="preserve">test_core.py::test_tampered_outside_payload PASSED</w:t>
+        <w:t xml:space="preserve">test_core.py::test_wrong_start_offset PASSED</w:t>
       </w:r>
     </w:p>
     <w:p>
@@ -28236,7 +28236,7 @@
           <w:sz w:val="15"/>
           <w:szCs w:val="15"/>
         </w:rPr>
-        <w:t xml:space="preserve">test_core.py::test_tampered_audio_upper_bits_in_region PASSED</w:t>
+        <w:t xml:space="preserve">test_core.py::test_wrong_public_key PASSED</w:t>
       </w:r>
     </w:p>
     <w:p>
@@ -28253,7 +28253,7 @@
           <w:sz w:val="15"/>
           <w:szCs w:val="15"/>
         </w:rPr>
-        <w:t xml:space="preserve">test_core.py::test_payload_bits_corrupted PASSED</w:t>
+        <w:t xml:space="preserve">test_core.py::test_tampered_outside_payload PASSED</w:t>
       </w:r>
     </w:p>
     <w:p>
@@ -28270,7 +28270,7 @@
           <w:sz w:val="15"/>
           <w:szCs w:val="15"/>
         </w:rPr>
-        <w:t xml:space="preserve">test_core.py::test_capacity_check PASSED</w:t>
+        <w:t xml:space="preserve">test_core.py::test_tampered_audio_upper_bits_in_region PASSED</w:t>
       </w:r>
     </w:p>
     <w:p>
@@ -28287,7 +28287,7 @@
           <w:sz w:val="15"/>
           <w:szCs w:val="15"/>
         </w:rPr>
-        <w:t xml:space="preserve">test_core.py::test_jpeg_output_refused PASSED</w:t>
+        <w:t xml:space="preserve">test_core.py::test_payload_bits_corrupted PASSED</w:t>
       </w:r>
     </w:p>
     <w:p>
@@ -28304,7 +28304,7 @@
           <w:sz w:val="15"/>
           <w:szCs w:val="15"/>
         </w:rPr>
-        <w:t xml:space="preserve">test_core.py::test_replay_nonce_unseen_by_default PASSED</w:t>
+        <w:t xml:space="preserve">test_core.py::test_capacity_check PASSED</w:t>
       </w:r>
     </w:p>
     <w:p>
@@ -28321,7 +28321,7 @@
           <w:sz w:val="15"/>
           <w:szCs w:val="15"/>
         </w:rPr>
-        <w:t xml:space="preserve">test_core.py::test_replay_nonce_seen_after_record PASSED</w:t>
+        <w:t xml:space="preserve">test_core.py::test_jpeg_output_refused PASSED</w:t>
       </w:r>
     </w:p>
     <w:p>
@@ -28338,7 +28338,7 @@
           <w:sz w:val="15"/>
           <w:szCs w:val="15"/>
         </w:rPr>
-        <w:t xml:space="preserve">test_core.py::test_replay_different_nonce_not_flagged PASSED</w:t>
+        <w:t xml:space="preserve">test_core.py::test_replay_nonce_unseen_by_default PASSED</w:t>
       </w:r>
     </w:p>
     <w:p>
@@ -28355,7 +28355,7 @@
           <w:sz w:val="15"/>
           <w:szCs w:val="15"/>
         </w:rPr>
-        <w:t xml:space="preserve">test_core.py::test_replay_clear_forgets_everything PASSED</w:t>
+        <w:t xml:space="preserve">test_core.py::test_replay_nonce_seen_after_record PASSED</w:t>
       </w:r>
     </w:p>
     <w:p>
@@ -28372,7 +28372,7 @@
           <w:sz w:val="15"/>
           <w:szCs w:val="15"/>
         </w:rPr>
-        <w:t xml:space="preserve">test_core.py::test_replay_clear_on_fresh_checkout PASSED</w:t>
+        <w:t xml:space="preserve">test_core.py::test_replay_different_nonce_not_flagged PASSED</w:t>
       </w:r>
     </w:p>
     <w:p>
@@ -28389,7 +28389,109 @@
           <w:sz w:val="15"/>
           <w:szCs w:val="15"/>
         </w:rPr>
+        <w:t xml:space="preserve">test_core.py::test_replay_clear_forgets_everything PASSED</w:t>
+      </w:r>
+    </w:p>
+    <w:p>
+      <w:pPr>
+        <w:shd w:fill="F3F4F6" w:color="auto" w:val="clear"/>
+        <w:spacing w:after="0" w:before="0"/>
+      </w:pPr>
+      <w:r>
+        <w:rPr>
+          <w:rFonts w:ascii="Consolas" w:cs="Consolas" w:eastAsia="Consolas" w:hAnsi="Consolas"/>
+          <w:b w:val="false"/>
+          <w:bCs w:val="false"/>
+          <w:color w:val="202124"/>
+          <w:sz w:val="15"/>
+          <w:szCs w:val="15"/>
+        </w:rPr>
+        <w:t xml:space="preserve">test_core.py::test_replay_clear_on_fresh_checkout PASSED</w:t>
+      </w:r>
+    </w:p>
+    <w:p>
+      <w:pPr>
+        <w:shd w:fill="F3F4F6" w:color="auto" w:val="clear"/>
+        <w:spacing w:after="0" w:before="0"/>
+      </w:pPr>
+      <w:r>
+        <w:rPr>
+          <w:rFonts w:ascii="Consolas" w:cs="Consolas" w:eastAsia="Consolas" w:hAnsi="Consolas"/>
+          <w:b w:val="false"/>
+          <w:bCs w:val="false"/>
+          <w:color w:val="202124"/>
+          <w:sz w:val="15"/>
+          <w:szCs w:val="15"/>
+        </w:rPr>
         <w:t xml:space="preserve">test_core.py::test_second_verify_is_replay_until_cleared PASSED</w:t>
+      </w:r>
+    </w:p>
+    <w:p>
+      <w:pPr>
+        <w:shd w:fill="F3F4F6" w:color="auto" w:val="clear"/>
+        <w:spacing w:after="0" w:before="0"/>
+      </w:pPr>
+      <w:r>
+        <w:rPr>
+          <w:rFonts w:ascii="Consolas" w:cs="Consolas" w:eastAsia="Consolas" w:hAnsi="Consolas"/>
+          <w:b w:val="false"/>
+          <w:bCs w:val="false"/>
+          <w:color w:val="202124"/>
+          <w:sz w:val="15"/>
+          <w:szCs w:val="15"/>
+        </w:rPr>
+        <w:t xml:space="preserve">test_core.py::test_psnr_identical_is_infinite PASSED</w:t>
+      </w:r>
+    </w:p>
+    <w:p>
+      <w:pPr>
+        <w:shd w:fill="F3F4F6" w:color="auto" w:val="clear"/>
+        <w:spacing w:after="0" w:before="0"/>
+      </w:pPr>
+      <w:r>
+        <w:rPr>
+          <w:rFonts w:ascii="Consolas" w:cs="Consolas" w:eastAsia="Consolas" w:hAnsi="Consolas"/>
+          <w:b w:val="false"/>
+          <w:bCs w:val="false"/>
+          <w:color w:val="202124"/>
+          <w:sz w:val="15"/>
+          <w:szCs w:val="15"/>
+        </w:rPr>
+        <w:t xml:space="preserve">test_core.py::test_psnr_drops_as_k_rises PASSED</w:t>
+      </w:r>
+    </w:p>
+    <w:p>
+      <w:pPr>
+        <w:shd w:fill="F3F4F6" w:color="auto" w:val="clear"/>
+        <w:spacing w:after="0" w:before="0"/>
+      </w:pPr>
+      <w:r>
+        <w:rPr>
+          <w:rFonts w:ascii="Consolas" w:cs="Consolas" w:eastAsia="Consolas" w:hAnsi="Consolas"/>
+          <w:b w:val="false"/>
+          <w:bCs w:val="false"/>
+          <w:color w:val="202124"/>
+          <w:sz w:val="15"/>
+          <w:szCs w:val="15"/>
+        </w:rPr>
+        <w:t xml:space="preserve">test_core.py::test_jpeg_cover_saved_as_png_is_authentic PASSED</w:t>
+      </w:r>
+    </w:p>
+    <w:p>
+      <w:pPr>
+        <w:shd w:fill="F3F4F6" w:color="auto" w:val="clear"/>
+        <w:spacing w:after="0" w:before="0"/>
+      </w:pPr>
+      <w:r>
+        <w:rPr>
+          <w:rFonts w:ascii="Consolas" w:cs="Consolas" w:eastAsia="Consolas" w:hAnsi="Consolas"/>
+          <w:b w:val="false"/>
+          <w:bCs w:val="false"/>
+          <w:color w:val="202124"/>
+          <w:sz w:val="15"/>
+          <w:szCs w:val="15"/>
+        </w:rPr>
+        <w:t xml:space="preserve">test_core.py::test_jpeg_recompression_destroys_payload PASSED</w:t>
       </w:r>
     </w:p>
     <w:p>

</xml_diff>